<commit_message>
humanised up to chapter 3
</commit_message>
<xml_diff>
--- a/Chapter 1-5 References.docx
+++ b/Chapter 1-5 References.docx
@@ -1881,6 +1881,634 @@
           <w:lang w:val="en-ZW"/>
         </w:rPr>
         <w:t>6i1.2306.</w:t>
+      </w:r>
+    </w:p>
+    <w:p>
+      <w:pPr>
+        <w:spacing w:line="360" w:lineRule="auto"/>
+        <w:jc w:val="both"/>
+        <w:rPr>
+          <w:rFonts w:ascii="Times New Roman" w:eastAsia="Times New Roman" w:hAnsi="Times New Roman" w:cs="Times New Roman"/>
+          <w:sz w:val="24"/>
+          <w:szCs w:val="24"/>
+          <w:lang w:val="en-ZW"/>
+        </w:rPr>
+      </w:pPr>
+    </w:p>
+    <w:p>
+      <w:pPr>
+        <w:spacing w:line="360" w:lineRule="auto"/>
+        <w:jc w:val="both"/>
+        <w:rPr>
+          <w:rFonts w:ascii="Times New Roman" w:eastAsia="Times New Roman" w:hAnsi="Times New Roman" w:cs="Times New Roman"/>
+          <w:b/>
+          <w:bCs/>
+          <w:sz w:val="24"/>
+          <w:szCs w:val="24"/>
+          <w:lang w:val="en-ZW"/>
+        </w:rPr>
+      </w:pPr>
+      <w:r>
+        <w:rPr>
+          <w:rFonts w:ascii="Times New Roman" w:eastAsia="Times New Roman" w:hAnsi="Times New Roman" w:cs="Times New Roman"/>
+          <w:b/>
+          <w:bCs/>
+          <w:sz w:val="24"/>
+          <w:szCs w:val="24"/>
+          <w:lang w:val="en-ZW"/>
+        </w:rPr>
+        <w:t>References</w:t>
+      </w:r>
+    </w:p>
+    <w:p>
+      <w:pPr>
+        <w:spacing w:line="360" w:lineRule="auto"/>
+        <w:jc w:val="both"/>
+        <w:rPr>
+          <w:rFonts w:ascii="Times New Roman" w:eastAsia="Times New Roman" w:hAnsi="Times New Roman" w:cs="Times New Roman"/>
+          <w:sz w:val="24"/>
+          <w:szCs w:val="24"/>
+          <w:lang w:val="en-ZW"/>
+        </w:rPr>
+      </w:pPr>
+      <w:r>
+        <w:rPr>
+          <w:rFonts w:ascii="Times New Roman" w:eastAsia="Times New Roman" w:hAnsi="Times New Roman" w:cs="Times New Roman"/>
+          <w:sz w:val="24"/>
+          <w:szCs w:val="24"/>
+          <w:lang w:val="en-ZW"/>
+        </w:rPr>
+        <w:t>References [1]</w:t>
+      </w:r>
+      <w:proofErr w:type="gramStart"/>
+      <w:r>
+        <w:rPr>
+          <w:rFonts w:ascii="Times New Roman" w:eastAsia="Times New Roman" w:hAnsi="Times New Roman" w:cs="Times New Roman"/>
+          <w:sz w:val="24"/>
+          <w:szCs w:val="24"/>
+          <w:lang w:val="en-ZW"/>
+        </w:rPr>
+        <w:t>–[</w:t>
+      </w:r>
+      <w:proofErr w:type="gramEnd"/>
+      <w:r>
+        <w:rPr>
+          <w:rFonts w:ascii="Times New Roman" w:eastAsia="Times New Roman" w:hAnsi="Times New Roman" w:cs="Times New Roman"/>
+          <w:sz w:val="24"/>
+          <w:szCs w:val="24"/>
+          <w:lang w:val="en-ZW"/>
+        </w:rPr>
+        <w:t>21] retain the numbering established in Chapters 1 and 2.</w:t>
+      </w:r>
+    </w:p>
+    <w:p>
+      <w:pPr>
+        <w:spacing w:line="360" w:lineRule="auto"/>
+        <w:jc w:val="both"/>
+        <w:rPr>
+          <w:rFonts w:ascii="Times New Roman" w:eastAsia="Times New Roman" w:hAnsi="Times New Roman" w:cs="Times New Roman"/>
+          <w:sz w:val="24"/>
+          <w:szCs w:val="24"/>
+          <w:lang w:val="en-ZW"/>
+        </w:rPr>
+      </w:pPr>
+      <w:r>
+        <w:rPr>
+          <w:rFonts w:ascii="Times New Roman" w:eastAsia="Times New Roman" w:hAnsi="Times New Roman" w:cs="Times New Roman"/>
+          <w:sz w:val="24"/>
+          <w:szCs w:val="24"/>
+          <w:lang w:val="en-ZW"/>
+        </w:rPr>
+        <w:t xml:space="preserve">[22] F. </w:t>
+      </w:r>
+      <w:proofErr w:type="spellStart"/>
+      <w:r>
+        <w:rPr>
+          <w:rFonts w:ascii="Times New Roman" w:eastAsia="Times New Roman" w:hAnsi="Times New Roman" w:cs="Times New Roman"/>
+          <w:sz w:val="24"/>
+          <w:szCs w:val="24"/>
+          <w:lang w:val="en-ZW"/>
+        </w:rPr>
+        <w:t>Pedregosa</w:t>
+      </w:r>
+      <w:proofErr w:type="spellEnd"/>
+      <w:r>
+        <w:rPr>
+          <w:rFonts w:ascii="Times New Roman" w:eastAsia="Times New Roman" w:hAnsi="Times New Roman" w:cs="Times New Roman"/>
+          <w:sz w:val="24"/>
+          <w:szCs w:val="24"/>
+          <w:lang w:val="en-ZW"/>
+        </w:rPr>
+        <w:t xml:space="preserve"> et al., “Scikit-learn: Machine learning in Python,” Journal of Machine Learning Research, vol. 12, pp. 2825–2830, 2011.</w:t>
+      </w:r>
+    </w:p>
+    <w:p>
+      <w:pPr>
+        <w:spacing w:line="360" w:lineRule="auto"/>
+        <w:jc w:val="both"/>
+        <w:rPr>
+          <w:rFonts w:ascii="Times New Roman" w:eastAsia="Times New Roman" w:hAnsi="Times New Roman" w:cs="Times New Roman"/>
+          <w:sz w:val="24"/>
+          <w:szCs w:val="24"/>
+          <w:lang w:val="en-ZW"/>
+        </w:rPr>
+      </w:pPr>
+      <w:r>
+        <w:rPr>
+          <w:rFonts w:ascii="Times New Roman" w:eastAsia="Times New Roman" w:hAnsi="Times New Roman" w:cs="Times New Roman"/>
+          <w:sz w:val="24"/>
+          <w:szCs w:val="24"/>
+          <w:lang w:val="en-ZW"/>
+        </w:rPr>
+        <w:t>For the Chapter 3 literature cited above, the previously established references retain their existing numbers, particularly:</w:t>
+      </w:r>
+    </w:p>
+    <w:p>
+      <w:pPr>
+        <w:spacing w:line="360" w:lineRule="auto"/>
+        <w:jc w:val="both"/>
+        <w:rPr>
+          <w:rFonts w:ascii="Times New Roman" w:eastAsia="Times New Roman" w:hAnsi="Times New Roman" w:cs="Times New Roman"/>
+          <w:sz w:val="24"/>
+          <w:szCs w:val="24"/>
+          <w:lang w:val="en-ZW"/>
+        </w:rPr>
+      </w:pPr>
+      <w:r>
+        <w:rPr>
+          <w:rFonts w:ascii="Times New Roman" w:eastAsia="Times New Roman" w:hAnsi="Times New Roman" w:cs="Times New Roman"/>
+          <w:sz w:val="24"/>
+          <w:szCs w:val="24"/>
+          <w:lang w:val="en-ZW"/>
+        </w:rPr>
+        <w:t xml:space="preserve">[5] R. I. T. Jensen and A. </w:t>
+      </w:r>
+      <w:proofErr w:type="spellStart"/>
+      <w:r>
+        <w:rPr>
+          <w:rFonts w:ascii="Times New Roman" w:eastAsia="Times New Roman" w:hAnsi="Times New Roman" w:cs="Times New Roman"/>
+          <w:sz w:val="24"/>
+          <w:szCs w:val="24"/>
+          <w:lang w:val="en-ZW"/>
+        </w:rPr>
+        <w:t>Iosifidis</w:t>
+      </w:r>
+      <w:proofErr w:type="spellEnd"/>
+      <w:r>
+        <w:rPr>
+          <w:rFonts w:ascii="Times New Roman" w:eastAsia="Times New Roman" w:hAnsi="Times New Roman" w:cs="Times New Roman"/>
+          <w:sz w:val="24"/>
+          <w:szCs w:val="24"/>
+          <w:lang w:val="en-ZW"/>
+        </w:rPr>
+        <w:t xml:space="preserve">, “Fighting money laundering with statistics and machine learning,” IEEE Access, vol. 11, pp. 8889–8903, 2023, </w:t>
+      </w:r>
+      <w:proofErr w:type="spellStart"/>
+      <w:r>
+        <w:rPr>
+          <w:rFonts w:ascii="Times New Roman" w:eastAsia="Times New Roman" w:hAnsi="Times New Roman" w:cs="Times New Roman"/>
+          <w:sz w:val="24"/>
+          <w:szCs w:val="24"/>
+          <w:lang w:val="en-ZW"/>
+        </w:rPr>
+        <w:t>doi</w:t>
+      </w:r>
+      <w:proofErr w:type="spellEnd"/>
+      <w:r>
+        <w:rPr>
+          <w:rFonts w:ascii="Times New Roman" w:eastAsia="Times New Roman" w:hAnsi="Times New Roman" w:cs="Times New Roman"/>
+          <w:sz w:val="24"/>
+          <w:szCs w:val="24"/>
+          <w:lang w:val="en-ZW"/>
+        </w:rPr>
+        <w:t>: 10.1109/ACCESS.2023.3239549. (</w:t>
+      </w:r>
+      <w:hyperlink r:id="rId4" w:tooltip="Fighting Money Laundering With Statistics and Machine Learning - Aarhus University" w:history="1">
+        <w:r>
+          <w:rPr>
+            <w:rStyle w:val="Hyperlink"/>
+            <w:rFonts w:ascii="Times New Roman" w:eastAsia="Times New Roman" w:hAnsi="Times New Roman" w:cs="Times New Roman"/>
+            <w:sz w:val="24"/>
+            <w:szCs w:val="24"/>
+            <w:lang w:val="en-ZW"/>
+          </w:rPr>
+          <w:t>Pure</w:t>
+        </w:r>
+      </w:hyperlink>
+      <w:r>
+        <w:rPr>
+          <w:rFonts w:ascii="Times New Roman" w:eastAsia="Times New Roman" w:hAnsi="Times New Roman" w:cs="Times New Roman"/>
+          <w:sz w:val="24"/>
+          <w:szCs w:val="24"/>
+          <w:lang w:val="en-ZW"/>
+        </w:rPr>
+        <w:t>)</w:t>
+      </w:r>
+    </w:p>
+    <w:p>
+      <w:pPr>
+        <w:spacing w:line="360" w:lineRule="auto"/>
+        <w:jc w:val="both"/>
+        <w:rPr>
+          <w:rFonts w:ascii="Times New Roman" w:eastAsia="Times New Roman" w:hAnsi="Times New Roman" w:cs="Times New Roman"/>
+          <w:sz w:val="24"/>
+          <w:szCs w:val="24"/>
+          <w:lang w:val="en-ZW"/>
+        </w:rPr>
+      </w:pPr>
+      <w:r>
+        <w:rPr>
+          <w:rFonts w:ascii="Times New Roman" w:eastAsia="Times New Roman" w:hAnsi="Times New Roman" w:cs="Times New Roman"/>
+          <w:sz w:val="24"/>
+          <w:szCs w:val="24"/>
+          <w:lang w:val="en-ZW"/>
+        </w:rPr>
+        <w:t xml:space="preserve">[6] P. </w:t>
+      </w:r>
+      <w:proofErr w:type="spellStart"/>
+      <w:r>
+        <w:rPr>
+          <w:rFonts w:ascii="Times New Roman" w:eastAsia="Times New Roman" w:hAnsi="Times New Roman" w:cs="Times New Roman"/>
+          <w:sz w:val="24"/>
+          <w:szCs w:val="24"/>
+          <w:lang w:val="en-ZW"/>
+        </w:rPr>
+        <w:t>Tertychnyi</w:t>
+      </w:r>
+      <w:proofErr w:type="spellEnd"/>
+      <w:r>
+        <w:rPr>
+          <w:rFonts w:ascii="Times New Roman" w:eastAsia="Times New Roman" w:hAnsi="Times New Roman" w:cs="Times New Roman"/>
+          <w:sz w:val="24"/>
+          <w:szCs w:val="24"/>
+          <w:lang w:val="en-ZW"/>
+        </w:rPr>
+        <w:t xml:space="preserve">, M. </w:t>
+      </w:r>
+      <w:proofErr w:type="spellStart"/>
+      <w:r>
+        <w:rPr>
+          <w:rFonts w:ascii="Times New Roman" w:eastAsia="Times New Roman" w:hAnsi="Times New Roman" w:cs="Times New Roman"/>
+          <w:sz w:val="24"/>
+          <w:szCs w:val="24"/>
+          <w:lang w:val="en-ZW"/>
+        </w:rPr>
+        <w:t>Godgildieva</w:t>
+      </w:r>
+      <w:proofErr w:type="spellEnd"/>
+      <w:r>
+        <w:rPr>
+          <w:rFonts w:ascii="Times New Roman" w:eastAsia="Times New Roman" w:hAnsi="Times New Roman" w:cs="Times New Roman"/>
+          <w:sz w:val="24"/>
+          <w:szCs w:val="24"/>
+          <w:lang w:val="en-ZW"/>
+        </w:rPr>
+        <w:t xml:space="preserve">, M. Dumas, and M. Ollikainen, “Time-aware and interpretable predictive monitoring system for Anti-Money Laundering,” Machine Learning with Applications, vol. 8, Art. no. 100306, 2022, </w:t>
+      </w:r>
+      <w:proofErr w:type="spellStart"/>
+      <w:r>
+        <w:rPr>
+          <w:rFonts w:ascii="Times New Roman" w:eastAsia="Times New Roman" w:hAnsi="Times New Roman" w:cs="Times New Roman"/>
+          <w:sz w:val="24"/>
+          <w:szCs w:val="24"/>
+          <w:lang w:val="en-ZW"/>
+        </w:rPr>
+        <w:t>doi</w:t>
+      </w:r>
+      <w:proofErr w:type="spellEnd"/>
+      <w:r>
+        <w:rPr>
+          <w:rFonts w:ascii="Times New Roman" w:eastAsia="Times New Roman" w:hAnsi="Times New Roman" w:cs="Times New Roman"/>
+          <w:sz w:val="24"/>
+          <w:szCs w:val="24"/>
+          <w:lang w:val="en-ZW"/>
+        </w:rPr>
+        <w:t>: 10.1016/j.mlwa.2022.100306. (</w:t>
+      </w:r>
+      <w:hyperlink r:id="rId5" w:tooltip="Time-aware and interpretable predictive monitoring system for Anti-Money Laundering - ScienceDirect" w:history="1">
+        <w:r>
+          <w:rPr>
+            <w:rStyle w:val="Hyperlink"/>
+            <w:rFonts w:ascii="Times New Roman" w:eastAsia="Times New Roman" w:hAnsi="Times New Roman" w:cs="Times New Roman"/>
+            <w:sz w:val="24"/>
+            <w:szCs w:val="24"/>
+            <w:lang w:val="en-ZW"/>
+          </w:rPr>
+          <w:t>ScienceDirect</w:t>
+        </w:r>
+      </w:hyperlink>
+      <w:r>
+        <w:rPr>
+          <w:rFonts w:ascii="Times New Roman" w:eastAsia="Times New Roman" w:hAnsi="Times New Roman" w:cs="Times New Roman"/>
+          <w:sz w:val="24"/>
+          <w:szCs w:val="24"/>
+          <w:lang w:val="en-ZW"/>
+        </w:rPr>
+        <w:t>)</w:t>
+      </w:r>
+    </w:p>
+    <w:p>
+      <w:pPr>
+        <w:spacing w:line="360" w:lineRule="auto"/>
+        <w:jc w:val="both"/>
+        <w:rPr>
+          <w:rFonts w:ascii="Times New Roman" w:eastAsia="Times New Roman" w:hAnsi="Times New Roman" w:cs="Times New Roman"/>
+          <w:sz w:val="24"/>
+          <w:szCs w:val="24"/>
+          <w:lang w:val="en-ZW"/>
+        </w:rPr>
+      </w:pPr>
+      <w:r>
+        <w:rPr>
+          <w:rFonts w:ascii="Times New Roman" w:eastAsia="Times New Roman" w:hAnsi="Times New Roman" w:cs="Times New Roman"/>
+          <w:sz w:val="24"/>
+          <w:szCs w:val="24"/>
+          <w:lang w:val="en-ZW"/>
+        </w:rPr>
+        <w:t xml:space="preserve">[7] E. Altman, J. </w:t>
+      </w:r>
+      <w:proofErr w:type="spellStart"/>
+      <w:r>
+        <w:rPr>
+          <w:rFonts w:ascii="Times New Roman" w:eastAsia="Times New Roman" w:hAnsi="Times New Roman" w:cs="Times New Roman"/>
+          <w:sz w:val="24"/>
+          <w:szCs w:val="24"/>
+          <w:lang w:val="en-ZW"/>
+        </w:rPr>
+        <w:t>Blanuša</w:t>
+      </w:r>
+      <w:proofErr w:type="spellEnd"/>
+      <w:r>
+        <w:rPr>
+          <w:rFonts w:ascii="Times New Roman" w:eastAsia="Times New Roman" w:hAnsi="Times New Roman" w:cs="Times New Roman"/>
+          <w:sz w:val="24"/>
+          <w:szCs w:val="24"/>
+          <w:lang w:val="en-ZW"/>
+        </w:rPr>
+        <w:t xml:space="preserve">, L. von </w:t>
+      </w:r>
+      <w:proofErr w:type="spellStart"/>
+      <w:r>
+        <w:rPr>
+          <w:rFonts w:ascii="Times New Roman" w:eastAsia="Times New Roman" w:hAnsi="Times New Roman" w:cs="Times New Roman"/>
+          <w:sz w:val="24"/>
+          <w:szCs w:val="24"/>
+          <w:lang w:val="en-ZW"/>
+        </w:rPr>
+        <w:t>Niederhäusern</w:t>
+      </w:r>
+      <w:proofErr w:type="spellEnd"/>
+      <w:r>
+        <w:rPr>
+          <w:rFonts w:ascii="Times New Roman" w:eastAsia="Times New Roman" w:hAnsi="Times New Roman" w:cs="Times New Roman"/>
+          <w:sz w:val="24"/>
+          <w:szCs w:val="24"/>
+          <w:lang w:val="en-ZW"/>
+        </w:rPr>
+        <w:t xml:space="preserve">, B. </w:t>
+      </w:r>
+      <w:proofErr w:type="spellStart"/>
+      <w:r>
+        <w:rPr>
+          <w:rFonts w:ascii="Times New Roman" w:eastAsia="Times New Roman" w:hAnsi="Times New Roman" w:cs="Times New Roman"/>
+          <w:sz w:val="24"/>
+          <w:szCs w:val="24"/>
+          <w:lang w:val="en-ZW"/>
+        </w:rPr>
+        <w:t>Egressy</w:t>
+      </w:r>
+      <w:proofErr w:type="spellEnd"/>
+      <w:r>
+        <w:rPr>
+          <w:rFonts w:ascii="Times New Roman" w:eastAsia="Times New Roman" w:hAnsi="Times New Roman" w:cs="Times New Roman"/>
+          <w:sz w:val="24"/>
+          <w:szCs w:val="24"/>
+          <w:lang w:val="en-ZW"/>
+        </w:rPr>
+        <w:t xml:space="preserve">, A. </w:t>
+      </w:r>
+      <w:proofErr w:type="spellStart"/>
+      <w:r>
+        <w:rPr>
+          <w:rFonts w:ascii="Times New Roman" w:eastAsia="Times New Roman" w:hAnsi="Times New Roman" w:cs="Times New Roman"/>
+          <w:sz w:val="24"/>
+          <w:szCs w:val="24"/>
+          <w:lang w:val="en-ZW"/>
+        </w:rPr>
+        <w:t>Anghel</w:t>
+      </w:r>
+      <w:proofErr w:type="spellEnd"/>
+      <w:r>
+        <w:rPr>
+          <w:rFonts w:ascii="Times New Roman" w:eastAsia="Times New Roman" w:hAnsi="Times New Roman" w:cs="Times New Roman"/>
+          <w:sz w:val="24"/>
+          <w:szCs w:val="24"/>
+          <w:lang w:val="en-ZW"/>
+        </w:rPr>
+        <w:t xml:space="preserve">, and K. </w:t>
+      </w:r>
+      <w:proofErr w:type="spellStart"/>
+      <w:r>
+        <w:rPr>
+          <w:rFonts w:ascii="Times New Roman" w:eastAsia="Times New Roman" w:hAnsi="Times New Roman" w:cs="Times New Roman"/>
+          <w:sz w:val="24"/>
+          <w:szCs w:val="24"/>
+          <w:lang w:val="en-ZW"/>
+        </w:rPr>
+        <w:t>Atasu</w:t>
+      </w:r>
+      <w:proofErr w:type="spellEnd"/>
+      <w:r>
+        <w:rPr>
+          <w:rFonts w:ascii="Times New Roman" w:eastAsia="Times New Roman" w:hAnsi="Times New Roman" w:cs="Times New Roman"/>
+          <w:sz w:val="24"/>
+          <w:szCs w:val="24"/>
+          <w:lang w:val="en-ZW"/>
+        </w:rPr>
+        <w:t>, “Realistic synthetic financial transactions for Anti-Money Laundering models,” Advances in Neural Information Processing Systems, vol. 36, 2023. (</w:t>
+      </w:r>
+      <w:hyperlink r:id="rId6" w:tooltip="Realistic Synthetic Financial Transactions for Anti-Money Laundering Models for NeurIPS 2023 - IBM Research" w:history="1">
+        <w:r>
+          <w:rPr>
+            <w:rStyle w:val="Hyperlink"/>
+            <w:rFonts w:ascii="Times New Roman" w:eastAsia="Times New Roman" w:hAnsi="Times New Roman" w:cs="Times New Roman"/>
+            <w:sz w:val="24"/>
+            <w:szCs w:val="24"/>
+            <w:lang w:val="en-ZW"/>
+          </w:rPr>
+          <w:t>IBM Research</w:t>
+        </w:r>
+      </w:hyperlink>
+      <w:r>
+        <w:rPr>
+          <w:rFonts w:ascii="Times New Roman" w:eastAsia="Times New Roman" w:hAnsi="Times New Roman" w:cs="Times New Roman"/>
+          <w:sz w:val="24"/>
+          <w:szCs w:val="24"/>
+          <w:lang w:val="en-ZW"/>
+        </w:rPr>
+        <w:t>)</w:t>
+      </w:r>
+    </w:p>
+    <w:p>
+      <w:pPr>
+        <w:spacing w:line="360" w:lineRule="auto"/>
+        <w:jc w:val="both"/>
+        <w:rPr>
+          <w:rFonts w:ascii="Times New Roman" w:eastAsia="Times New Roman" w:hAnsi="Times New Roman" w:cs="Times New Roman"/>
+          <w:sz w:val="24"/>
+          <w:szCs w:val="24"/>
+          <w:lang w:val="en-ZW"/>
+        </w:rPr>
+      </w:pPr>
+      <w:r>
+        <w:rPr>
+          <w:rFonts w:ascii="Times New Roman" w:eastAsia="Times New Roman" w:hAnsi="Times New Roman" w:cs="Times New Roman"/>
+          <w:sz w:val="24"/>
+          <w:szCs w:val="24"/>
+          <w:lang w:val="en-ZW"/>
+        </w:rPr>
+        <w:t xml:space="preserve">[19] M. </w:t>
+      </w:r>
+      <w:proofErr w:type="spellStart"/>
+      <w:r>
+        <w:rPr>
+          <w:rFonts w:ascii="Times New Roman" w:eastAsia="Times New Roman" w:hAnsi="Times New Roman" w:cs="Times New Roman"/>
+          <w:sz w:val="24"/>
+          <w:szCs w:val="24"/>
+          <w:lang w:val="en-ZW"/>
+        </w:rPr>
+        <w:t>Jullum</w:t>
+      </w:r>
+      <w:proofErr w:type="spellEnd"/>
+      <w:r>
+        <w:rPr>
+          <w:rFonts w:ascii="Times New Roman" w:eastAsia="Times New Roman" w:hAnsi="Times New Roman" w:cs="Times New Roman"/>
+          <w:sz w:val="24"/>
+          <w:szCs w:val="24"/>
+          <w:lang w:val="en-ZW"/>
+        </w:rPr>
+        <w:t xml:space="preserve">, A. </w:t>
+      </w:r>
+      <w:proofErr w:type="spellStart"/>
+      <w:r>
+        <w:rPr>
+          <w:rFonts w:ascii="Times New Roman" w:eastAsia="Times New Roman" w:hAnsi="Times New Roman" w:cs="Times New Roman"/>
+          <w:sz w:val="24"/>
+          <w:szCs w:val="24"/>
+          <w:lang w:val="en-ZW"/>
+        </w:rPr>
+        <w:t>Løland</w:t>
+      </w:r>
+      <w:proofErr w:type="spellEnd"/>
+      <w:r>
+        <w:rPr>
+          <w:rFonts w:ascii="Times New Roman" w:eastAsia="Times New Roman" w:hAnsi="Times New Roman" w:cs="Times New Roman"/>
+          <w:sz w:val="24"/>
+          <w:szCs w:val="24"/>
+          <w:lang w:val="en-ZW"/>
+        </w:rPr>
+        <w:t xml:space="preserve">, R. B. </w:t>
+      </w:r>
+      <w:proofErr w:type="spellStart"/>
+      <w:r>
+        <w:rPr>
+          <w:rFonts w:ascii="Times New Roman" w:eastAsia="Times New Roman" w:hAnsi="Times New Roman" w:cs="Times New Roman"/>
+          <w:sz w:val="24"/>
+          <w:szCs w:val="24"/>
+          <w:lang w:val="en-ZW"/>
+        </w:rPr>
+        <w:t>Huseby</w:t>
+      </w:r>
+      <w:proofErr w:type="spellEnd"/>
+      <w:r>
+        <w:rPr>
+          <w:rFonts w:ascii="Times New Roman" w:eastAsia="Times New Roman" w:hAnsi="Times New Roman" w:cs="Times New Roman"/>
+          <w:sz w:val="24"/>
+          <w:szCs w:val="24"/>
+          <w:lang w:val="en-ZW"/>
+        </w:rPr>
+        <w:t xml:space="preserve">, G. </w:t>
+      </w:r>
+      <w:proofErr w:type="spellStart"/>
+      <w:r>
+        <w:rPr>
+          <w:rFonts w:ascii="Times New Roman" w:eastAsia="Times New Roman" w:hAnsi="Times New Roman" w:cs="Times New Roman"/>
+          <w:sz w:val="24"/>
+          <w:szCs w:val="24"/>
+          <w:lang w:val="en-ZW"/>
+        </w:rPr>
+        <w:t>Ånonsen</w:t>
+      </w:r>
+      <w:proofErr w:type="spellEnd"/>
+      <w:r>
+        <w:rPr>
+          <w:rFonts w:ascii="Times New Roman" w:eastAsia="Times New Roman" w:hAnsi="Times New Roman" w:cs="Times New Roman"/>
+          <w:sz w:val="24"/>
+          <w:szCs w:val="24"/>
+          <w:lang w:val="en-ZW"/>
+        </w:rPr>
+        <w:t xml:space="preserve">, and J. </w:t>
+      </w:r>
+      <w:proofErr w:type="spellStart"/>
+      <w:r>
+        <w:rPr>
+          <w:rFonts w:ascii="Times New Roman" w:eastAsia="Times New Roman" w:hAnsi="Times New Roman" w:cs="Times New Roman"/>
+          <w:sz w:val="24"/>
+          <w:szCs w:val="24"/>
+          <w:lang w:val="en-ZW"/>
+        </w:rPr>
+        <w:t>Lorentzen</w:t>
+      </w:r>
+      <w:proofErr w:type="spellEnd"/>
+      <w:r>
+        <w:rPr>
+          <w:rFonts w:ascii="Times New Roman" w:eastAsia="Times New Roman" w:hAnsi="Times New Roman" w:cs="Times New Roman"/>
+          <w:sz w:val="24"/>
+          <w:szCs w:val="24"/>
+          <w:lang w:val="en-ZW"/>
+        </w:rPr>
+        <w:t xml:space="preserve">, “Detecting money laundering transactions with machine learning,” Journal of Money Laundering Control, vol. 23, no. 1, pp. 173–186, 2020, </w:t>
+      </w:r>
+      <w:proofErr w:type="spellStart"/>
+      <w:r>
+        <w:rPr>
+          <w:rFonts w:ascii="Times New Roman" w:eastAsia="Times New Roman" w:hAnsi="Times New Roman" w:cs="Times New Roman"/>
+          <w:sz w:val="24"/>
+          <w:szCs w:val="24"/>
+          <w:lang w:val="en-ZW"/>
+        </w:rPr>
+        <w:t>doi</w:t>
+      </w:r>
+      <w:proofErr w:type="spellEnd"/>
+      <w:r>
+        <w:rPr>
+          <w:rFonts w:ascii="Times New Roman" w:eastAsia="Times New Roman" w:hAnsi="Times New Roman" w:cs="Times New Roman"/>
+          <w:sz w:val="24"/>
+          <w:szCs w:val="24"/>
+          <w:lang w:val="en-ZW"/>
+        </w:rPr>
+        <w:t>: 10.1108/JMLC-07-2019-0055. (</w:t>
+      </w:r>
+      <w:hyperlink r:id="rId7" w:tooltip="Detecting money laundering transactions with machine learning - ScienceDirect" w:history="1">
+        <w:r>
+          <w:rPr>
+            <w:rStyle w:val="Hyperlink"/>
+            <w:rFonts w:ascii="Times New Roman" w:eastAsia="Times New Roman" w:hAnsi="Times New Roman" w:cs="Times New Roman"/>
+            <w:sz w:val="24"/>
+            <w:szCs w:val="24"/>
+            <w:lang w:val="en-ZW"/>
+          </w:rPr>
+          <w:t>ScienceDirect</w:t>
+        </w:r>
+      </w:hyperlink>
+      <w:r>
+        <w:rPr>
+          <w:rFonts w:ascii="Times New Roman" w:eastAsia="Times New Roman" w:hAnsi="Times New Roman" w:cs="Times New Roman"/>
+          <w:sz w:val="24"/>
+          <w:szCs w:val="24"/>
+          <w:lang w:val="en-ZW"/>
+        </w:rPr>
+        <w:t>)</w:t>
       </w:r>
     </w:p>
     <w:p>
@@ -2842,6 +3470,17 @@
       <w:spacing w:val="5"/>
     </w:rPr>
   </w:style>
+  <w:style w:type="character" w:styleId="Hyperlink">
+    <w:name w:val="Hyperlink"/>
+    <w:basedOn w:val="DefaultParagraphFont"/>
+    <w:uiPriority w:val="99"/>
+    <w:unhideWhenUsed/>
+    <w:rsid w:val="00D9417C"/>
+    <w:rPr>
+      <w:color w:val="0563C1" w:themeColor="hyperlink"/>
+      <w:u w:val="single"/>
+    </w:rPr>
+  </w:style>
 </w:styles>
 </file>
 

</xml_diff>